<commit_message>
Usar nombre completo del estudiante en documentos fase 1
</commit_message>
<xml_diff>
--- a/evidencias/fase1/grupal/1.5_GuiaEstudiante_Fase 1_Definicion Proyecto APT.docx
+++ b/evidencias/fase1/grupal/1.5_GuiaEstudiante_Fase 1_Definicion Proyecto APT.docx
@@ -562,12 +562,12 @@
             </w:pPr>
             <w:r/>
             <w:r>
-              <w:t>Jonatan Roa</w:t>
-            </w:r>
-          </w:p>
-          <w:p>
-            <w:r>
-              <w:t>Jonatan Roa</w:t>
+              <w:t>Jonatan Alexander Nicolas Roa Carrasco</w:t>
+            </w:r>
+          </w:p>
+          <w:p>
+            <w:r>
+              <w:t>Jonatan Alexander Nicolas Roa Carrasco</w:t>
             </w:r>
           </w:p>
         </w:tc>

</xml_diff>